<commit_message>
Ret salgsløfterne til den faktiske Pro-værdi
Pro-salg lovede hosted-funktioner, som ikke findes. Copy, pakker, privacy og produkttruth afspejler nu kun verificerbar funktionalitet.
</commit_message>
<xml_diff>
--- a/book/eu-website-compliance-guide-2026.docx
+++ b/book/eu-website-compliance-guide-2026.docx
@@ -292,7 +292,7 @@
     </w:p>
     <w:p>
       <w:r>
-        <w:t>Where you see references to the EUComply scanner (https://auditedwp.pages.dev/scan/), these are genuinely free tools that check the technical requirements described in that chapter — you can verify your progress without signing up or paying anything.</w:t>
+        <w:t>Where you see references to the EUComply scanner (https://eucomplypro.com/scan/), these are genuinely free tools that check the technical requirements described in that chapter — you can verify your progress without signing up or paying anything.</w:t>
       </w:r>
     </w:p>
     <w:p>
@@ -932,7 +932,7 @@
     </w:p>
     <w:p>
       <w:r>
-        <w:t>- EUComply Privacy Policy Generator: https://auditedwp.pages.dev/privacy-policy-generator/</w:t>
+        <w:t>- EUComply Privacy Policy Generator: https://eucomplypro.com/privacy-policy-generator/</w:t>
       </w:r>
     </w:p>
     <w:p>
@@ -947,7 +947,7 @@
     </w:p>
     <w:p>
       <w:r>
-        <w:t>Important: A generated policy is a starting point. You must review it and customise it to match your actual data processing. Run a scan on your site (https://auditedwp.pages.dev/scan/) to verify your privacy policy link is properly placed and accessible.</w:t>
+        <w:t>Important: A generated policy is a starting point. You must review it and customise it to match your actual data processing. Run a scan on your site (https://eucomplypro.com/scan/) to verify your privacy policy link is properly placed and accessible.</w:t>
       </w:r>
     </w:p>
     <w:p>
@@ -1344,7 +1344,7 @@
     </w:p>
     <w:p>
       <w:r>
-        <w:t>Run your site through the free EUComply scanner at https://auditedwp.pages.dev/scan/ — it checks all security headers and email authentication records.</w:t>
+        <w:t>Run your site through the free EUComply scanner at https://eucomplypro.com/scan/ — it checks all security headers and email authentication records.</w:t>
       </w:r>
     </w:p>
     <w:p>
@@ -2725,7 +2725,7 @@
         <w:rPr>
           <w:sz w:val="21"/>
         </w:rPr>
-        <w:t>☐ Run a compliance scan (https://auditedwp.pages.dev/scan/)</w:t>
+        <w:t>☐ Run a compliance scan (https://eucomplypro.com/scan/)</w:t>
       </w:r>
     </w:p>
     <w:p>
@@ -2911,7 +2911,7 @@
     </w:p>
     <w:p>
       <w:r>
-        <w:t>For automated monthly scanning, consider EUComply Pro (https://auditedwp.pages.dev/pro/) which runs daily checks and alerts you when something changes.</w:t>
+        <w:t>For a free point-in-time check, use the EUComply scanner (https://eucomplypro.com/scan/). The current Pro license is for WordPress document tools at https://eucomplypro.com/pro/; hosted daily monitoring is not included.</w:t>
       </w:r>
     </w:p>
     <w:p>
@@ -2934,7 +2934,7 @@
     </w:p>
     <w:p>
       <w:r>
-        <w:t>- EUComply Scanner (free, no signup): https://auditedwp.pages.dev/scan/</w:t>
+        <w:t>- EUComply Scanner (free, no signup): https://eucomplypro.com/scan/</w:t>
       </w:r>
     </w:p>
     <w:p>
@@ -3041,7 +3041,7 @@
     </w:p>
     <w:p>
       <w:r>
-        <w:t>- EUComply generators: https://auditedwp.pages.dev/tools/</w:t>
+        <w:t>- EUComply generators: https://eucomplypro.com/tools/</w:t>
       </w:r>
     </w:p>
     <w:p>
@@ -3111,12 +3111,12 @@
     </w:p>
     <w:p>
       <w:r>
-        <w:t>*For a free compliance scan of your website, visit https://auditedwp.pages.dev/scan/*</w:t>
-      </w:r>
-    </w:p>
-    <w:p>
-      <w:r>
-        <w:t>*For automated daily monitoring with alerts and PDF reports, visit https://auditedwp.pages.dev/pro/*</w:t>
+        <w:t>*For a free point-in-time compliance scan of your website, visit https://eucomplypro.com/scan/*</w:t>
+      </w:r>
+    </w:p>
+    <w:p>
+      <w:r>
+        <w:t>*For the current WordPress Pro document tools, visit https://eucomplypro.com/pro/*. Hosted daily monitoring and runtime PDF reports are not included today.*</w:t>
       </w:r>
     </w:p>
     <w:p>
@@ -3160,7 +3160,7 @@
           <w:color w:val="1A5CD3"/>
           <w:sz w:val="20"/>
         </w:rPr>
-        <w:t>Free compliance scan: https://auditedwp.pages.dev/scan/</w:t>
+        <w:t>Free point-in-time scan: https://eucomplypro.com/scan/</w:t>
       </w:r>
     </w:p>
     <w:p>
@@ -3172,7 +3172,7 @@
           <w:color w:val="1A5CD3"/>
           <w:sz w:val="20"/>
         </w:rPr>
-        <w:t>Automated daily monitoring: https://auditedwp.pages.dev/pro/</w:t>
+        <w:t>Current WordPress Pro document tools: https://eucomplypro.com/pro/</w:t>
       </w:r>
     </w:p>
     <w:sectPr>

</xml_diff>